<commit_message>
Added vihar2 and vihar3
</commit_message>
<xml_diff>
--- a/docs/vihari3/Vihari Gardens 3.docx
+++ b/docs/vihari3/Vihari Gardens 3.docx
@@ -1,6 +1,6 @@
 
 <file path=word/document.xml><?xml version="1.0" encoding="utf-8"?>
-<w:document xmlns:wpc="http://schemas.microsoft.com/office/word/2010/wordprocessingCanvas" xmlns:cx="http://schemas.microsoft.com/office/drawing/2014/chartex" xmlns:cx1="http://schemas.microsoft.com/office/drawing/2015/9/8/chartex" xmlns:mc="http://schemas.openxmlformats.org/markup-compatibility/2006" xmlns:o="urn:schemas-microsoft-com:office:office" xmlns:r="http://schemas.openxmlformats.org/officeDocument/2006/relationships" xmlns:m="http://schemas.openxmlformats.org/officeDocument/2006/math" xmlns:v="urn:schemas-microsoft-com:vml" xmlns:wp14="http://schemas.microsoft.com/office/word/2010/wordprocessingDrawing" xmlns:wp="http://schemas.openxmlformats.org/drawingml/2006/wordprocessingDrawing" xmlns:w10="urn:schemas-microsoft-com:office:word" xmlns:w="http://schemas.openxmlformats.org/wordprocessingml/2006/main" xmlns:w14="http://schemas.microsoft.com/office/word/2010/wordml" xmlns:w15="http://schemas.microsoft.com/office/word/2012/wordml" xmlns:w16se="http://schemas.microsoft.com/office/word/2015/wordml/symex" xmlns:wpg="http://schemas.microsoft.com/office/word/2010/wordprocessingGroup" xmlns:wpi="http://schemas.microsoft.com/office/word/2010/wordprocessingInk" xmlns:wne="http://schemas.microsoft.com/office/word/2006/wordml" xmlns:wps="http://schemas.microsoft.com/office/word/2010/wordprocessingShape" mc:Ignorable="w14 w15 w16se wp14">
+<w:document xmlns:wpc="http://schemas.microsoft.com/office/word/2010/wordprocessingCanvas" xmlns:mc="http://schemas.openxmlformats.org/markup-compatibility/2006" xmlns:o="urn:schemas-microsoft-com:office:office" xmlns:r="http://schemas.openxmlformats.org/officeDocument/2006/relationships" xmlns:m="http://schemas.openxmlformats.org/officeDocument/2006/math" xmlns:v="urn:schemas-microsoft-com:vml" xmlns:wp14="http://schemas.microsoft.com/office/word/2010/wordprocessingDrawing" xmlns:wp="http://schemas.openxmlformats.org/drawingml/2006/wordprocessingDrawing" xmlns:w10="urn:schemas-microsoft-com:office:word" xmlns:w="http://schemas.openxmlformats.org/wordprocessingml/2006/main" xmlns:w14="http://schemas.microsoft.com/office/word/2010/wordml" xmlns:w15="http://schemas.microsoft.com/office/word/2012/wordml" xmlns:wpg="http://schemas.microsoft.com/office/word/2010/wordprocessingGroup" xmlns:wpi="http://schemas.microsoft.com/office/word/2010/wordprocessingInk" xmlns:wne="http://schemas.microsoft.com/office/word/2006/wordml" xmlns:wps="http://schemas.microsoft.com/office/word/2010/wordprocessingShape" mc:Ignorable="w14 w15 wp14">
   <w:body>
     <w:p>
       <w:pPr>
@@ -100,7 +100,7 @@
         <w:rPr>
           <w:rFonts w:ascii="Times New Roman" w:hAnsi="Times New Roman" w:cs="Times New Roman"/>
           <w:noProof/>
-          <w:lang w:eastAsia="en-IN"/>
+          <w:lang w:eastAsia="en-IN" w:bidi="ar-SA"/>
         </w:rPr>
         <w:drawing>
           <wp:anchor distT="0" distB="0" distL="114300" distR="114300" simplePos="0" relativeHeight="251658240" behindDoc="1" locked="0" layoutInCell="1" allowOverlap="1" wp14:anchorId="78D2A53A" wp14:editId="44199409">
@@ -169,7 +169,7 @@
         <w:rPr>
           <w:rFonts w:ascii="Times New Roman" w:hAnsi="Times New Roman" w:cs="Times New Roman"/>
           <w:noProof/>
-          <w:lang w:eastAsia="en-IN"/>
+          <w:lang w:eastAsia="en-IN" w:bidi="ar-SA"/>
         </w:rPr>
         <w:drawing>
           <wp:anchor distT="0" distB="0" distL="114300" distR="114300" simplePos="0" relativeHeight="251659264" behindDoc="1" locked="0" layoutInCell="1" allowOverlap="1" wp14:anchorId="3671525B" wp14:editId="34714194">
@@ -364,7 +364,7 @@
         <w:rPr>
           <w:rFonts w:ascii="Times New Roman" w:hAnsi="Times New Roman" w:cs="Times New Roman"/>
           <w:noProof/>
-          <w:lang w:eastAsia="en-IN"/>
+          <w:lang w:eastAsia="en-IN" w:bidi="ar-SA"/>
         </w:rPr>
         <mc:AlternateContent>
           <mc:Choice Requires="wps">
@@ -587,7 +587,7 @@
               </wp:anchor>
             </w:drawing>
           </mc:Choice>
-          <mc:Fallback>
+          <mc:Fallback xmlns:w16se="http://schemas.microsoft.com/office/word/2015/wordml/symex" xmlns:cx1="http://schemas.microsoft.com/office/drawing/2015/9/8/chartex" xmlns:cx="http://schemas.microsoft.com/office/drawing/2014/chartex">
             <w:pict>
               <v:shapetype w14:anchorId="0CE82422" id="_x0000_t202" coordsize="21600,21600" o:spt="202" path="m,l,21600r21600,l21600,xe">
                 <v:stroke joinstyle="miter"/>
@@ -1210,8 +1210,6 @@
         </w:rPr>
         <w:t xml:space="preserve">Free Maintenance of farm lands </w:t>
       </w:r>
-      <w:bookmarkStart w:id="0" w:name="_GoBack"/>
-      <w:bookmarkEnd w:id="0"/>
     </w:p>
     <w:p>
       <w:pPr>
@@ -1286,29 +1284,7 @@
           <w:szCs w:val="26"/>
           <w:lang w:eastAsia="en-IN"/>
         </w:rPr>
-        <w:t xml:space="preserve">24 </w:t>
-      </w:r>
-      <w:proofErr w:type="gramStart"/>
-      <w:r>
-        <w:rPr>
-          <w:rFonts w:ascii="Work Sans" w:eastAsia="Times New Roman" w:hAnsi="Work Sans" w:cs="Times New Roman"/>
-          <w:color w:val="474747"/>
-          <w:sz w:val="26"/>
-          <w:szCs w:val="26"/>
-          <w:lang w:eastAsia="en-IN"/>
-        </w:rPr>
-        <w:t>hours</w:t>
-      </w:r>
-      <w:proofErr w:type="gramEnd"/>
-      <w:r>
-        <w:rPr>
-          <w:rFonts w:ascii="Work Sans" w:eastAsia="Times New Roman" w:hAnsi="Work Sans" w:cs="Times New Roman"/>
-          <w:color w:val="474747"/>
-          <w:sz w:val="26"/>
-          <w:szCs w:val="26"/>
-          <w:lang w:eastAsia="en-IN"/>
-        </w:rPr>
-        <w:t xml:space="preserve"> security</w:t>
+        <w:t>24 hours security</w:t>
       </w:r>
     </w:p>
     <w:p>
@@ -1513,7 +1489,7 @@
           <w:szCs w:val="26"/>
           <w:lang w:eastAsia="en-IN"/>
         </w:rPr>
-        <w:t xml:space="preserve"> from </w:t>
+        <w:t xml:space="preserve"> from Vizag NAD and 54 </w:t>
       </w:r>
       <w:proofErr w:type="spellStart"/>
       <w:r>
@@ -1524,7 +1500,7 @@
           <w:szCs w:val="26"/>
           <w:lang w:eastAsia="en-IN"/>
         </w:rPr>
-        <w:t>Vizag</w:t>
+        <w:t>Kms</w:t>
       </w:r>
       <w:proofErr w:type="spellEnd"/>
       <w:r>
@@ -1535,51 +1511,7 @@
           <w:szCs w:val="26"/>
           <w:lang w:eastAsia="en-IN"/>
         </w:rPr>
-        <w:t xml:space="preserve"> NAD and 54 </w:t>
-      </w:r>
-      <w:proofErr w:type="spellStart"/>
-      <w:r>
-        <w:rPr>
-          <w:rFonts w:ascii="Times New Roman" w:eastAsia="Times New Roman" w:hAnsi="Times New Roman" w:cs="Times New Roman"/>
-          <w:color w:val="474747"/>
-          <w:sz w:val="26"/>
-          <w:szCs w:val="26"/>
-          <w:lang w:eastAsia="en-IN"/>
-        </w:rPr>
-        <w:t>Kms</w:t>
-      </w:r>
-      <w:proofErr w:type="spellEnd"/>
-      <w:r>
-        <w:rPr>
-          <w:rFonts w:ascii="Times New Roman" w:eastAsia="Times New Roman" w:hAnsi="Times New Roman" w:cs="Times New Roman"/>
-          <w:color w:val="474747"/>
-          <w:sz w:val="26"/>
-          <w:szCs w:val="26"/>
-          <w:lang w:eastAsia="en-IN"/>
-        </w:rPr>
-        <w:t xml:space="preserve"> from </w:t>
-      </w:r>
-      <w:proofErr w:type="spellStart"/>
-      <w:r>
-        <w:rPr>
-          <w:rFonts w:ascii="Times New Roman" w:eastAsia="Times New Roman" w:hAnsi="Times New Roman" w:cs="Times New Roman"/>
-          <w:color w:val="474747"/>
-          <w:sz w:val="26"/>
-          <w:szCs w:val="26"/>
-          <w:lang w:eastAsia="en-IN"/>
-        </w:rPr>
-        <w:t>Vizag</w:t>
-      </w:r>
-      <w:proofErr w:type="spellEnd"/>
-      <w:r>
-        <w:rPr>
-          <w:rFonts w:ascii="Times New Roman" w:eastAsia="Times New Roman" w:hAnsi="Times New Roman" w:cs="Times New Roman"/>
-          <w:color w:val="474747"/>
-          <w:sz w:val="26"/>
-          <w:szCs w:val="26"/>
-          <w:lang w:eastAsia="en-IN"/>
-        </w:rPr>
-        <w:t xml:space="preserve"> Bus stand.</w:t>
+        <w:t xml:space="preserve"> from Vizag Bus stand.</w:t>
       </w:r>
     </w:p>
     <w:p>
@@ -1680,7 +1612,6 @@
         <w:t xml:space="preserve"> to </w:t>
       </w:r>
       <w:proofErr w:type="spellStart"/>
-      <w:proofErr w:type="gramStart"/>
       <w:r>
         <w:rPr>
           <w:rFonts w:ascii="Times New Roman" w:eastAsia="Times New Roman" w:hAnsi="Times New Roman" w:cs="Times New Roman"/>
@@ -1692,7 +1623,6 @@
         <w:t>R.Sivaram</w:t>
       </w:r>
       <w:proofErr w:type="spellEnd"/>
-      <w:proofErr w:type="gramEnd"/>
       <w:r>
         <w:rPr>
           <w:rFonts w:ascii="Times New Roman" w:eastAsia="Times New Roman" w:hAnsi="Times New Roman" w:cs="Times New Roman"/>
@@ -2393,6 +2323,8 @@
         </w:rPr>
         <w:t>jaitradevelopers@gmail.com</w:t>
       </w:r>
+      <w:bookmarkStart w:id="0" w:name="_GoBack"/>
+      <w:bookmarkEnd w:id="0"/>
     </w:p>
     <w:p>
       <w:pPr>
@@ -2445,7 +2377,96 @@
           <w:szCs w:val="26"/>
           <w:lang w:val="en-US" w:eastAsia="en-IN"/>
         </w:rPr>
-        <w:t xml:space="preserve"> https://maps.app.goo.gl/LRHmjJafE4hkXnDY6</w:t>
+        <w:t xml:space="preserve"> </w:t>
+      </w:r>
+      <w:hyperlink r:id="rId7" w:history="1">
+        <w:r>
+          <w:rPr>
+            <w:rStyle w:val="Hyperlink"/>
+            <w:rFonts w:ascii="Times New Roman" w:eastAsia="Times New Roman" w:hAnsi="Times New Roman" w:cs="Times New Roman"/>
+            <w:sz w:val="26"/>
+            <w:szCs w:val="26"/>
+            <w:lang w:val="en-US" w:eastAsia="en-IN"/>
+          </w:rPr>
+          <w:t>https://maps.app.goo.gl/LRHmjJafE4hkXnDY6</w:t>
+        </w:r>
+      </w:hyperlink>
+    </w:p>
+    <w:p>
+      <w:pPr>
+        <w:ind w:left="142"/>
+        <w:rPr>
+          <w:rFonts w:ascii="Times New Roman" w:eastAsia="Times New Roman" w:hAnsi="Times New Roman" w:cs="Times New Roman"/>
+          <w:color w:val="474747"/>
+          <w:sz w:val="26"/>
+          <w:szCs w:val="26"/>
+          <w:lang w:val="en-US" w:eastAsia="en-IN"/>
+        </w:rPr>
+      </w:pPr>
+      <w:r>
+        <w:rPr>
+          <w:rFonts w:ascii="Times New Roman" w:eastAsia="Times New Roman" w:hAnsi="Times New Roman" w:cs="Times New Roman"/>
+          <w:color w:val="474747"/>
+          <w:sz w:val="26"/>
+          <w:szCs w:val="26"/>
+          <w:lang w:val="en-US" w:eastAsia="en-IN"/>
+        </w:rPr>
+        <w:t>&lt;iframe src="https://www.google.com/maps/embed?pb=!1m18!1m12!1m3!1d3800.612619563331!2d82.8973074!3d17.715750799999995!2m3!1f0!2f0!3f0!3m2!1i1024!2i768!</w:t>
+      </w:r>
+      <w:r>
+        <w:rPr>
+          <w:rFonts w:ascii="Times New Roman" w:eastAsia="Times New Roman" w:hAnsi="Times New Roman" w:cs="Times New Roman"/>
+          <w:color w:val="474747"/>
+          <w:sz w:val="26"/>
+          <w:szCs w:val="26"/>
+          <w:lang w:val="en-US" w:eastAsia="en-IN"/>
+        </w:rPr>
+        <w:lastRenderedPageBreak/>
+        <w:t xml:space="preserve">4f13.1!3m3!1m2!1s0x3a399d004830eb5f%3A0xb5e2c960c3b9e179!2sVihari%20gardens%203!5e0!3m2!1sen!2sin!4v1720439831385!5m2!1sen!2sin" width="600" height="450" style="border:0;" </w:t>
+      </w:r>
+      <w:proofErr w:type="spellStart"/>
+      <w:r>
+        <w:rPr>
+          <w:rFonts w:ascii="Times New Roman" w:eastAsia="Times New Roman" w:hAnsi="Times New Roman" w:cs="Times New Roman"/>
+          <w:color w:val="474747"/>
+          <w:sz w:val="26"/>
+          <w:szCs w:val="26"/>
+          <w:lang w:val="en-US" w:eastAsia="en-IN"/>
+        </w:rPr>
+        <w:t>allowfullscreen</w:t>
+      </w:r>
+      <w:proofErr w:type="spellEnd"/>
+      <w:r>
+        <w:rPr>
+          <w:rFonts w:ascii="Times New Roman" w:eastAsia="Times New Roman" w:hAnsi="Times New Roman" w:cs="Times New Roman"/>
+          <w:color w:val="474747"/>
+          <w:sz w:val="26"/>
+          <w:szCs w:val="26"/>
+          <w:lang w:val="en-US" w:eastAsia="en-IN"/>
+        </w:rPr>
+        <w:t xml:space="preserve">="" loading="lazy" </w:t>
+      </w:r>
+      <w:proofErr w:type="spellStart"/>
+      <w:r>
+        <w:rPr>
+          <w:rFonts w:ascii="Times New Roman" w:eastAsia="Times New Roman" w:hAnsi="Times New Roman" w:cs="Times New Roman"/>
+          <w:color w:val="474747"/>
+          <w:sz w:val="26"/>
+          <w:szCs w:val="26"/>
+          <w:lang w:val="en-US" w:eastAsia="en-IN"/>
+        </w:rPr>
+        <w:t>referrerpolicy</w:t>
+      </w:r>
+      <w:proofErr w:type="spellEnd"/>
+      <w:r>
+        <w:rPr>
+          <w:rFonts w:ascii="Times New Roman" w:eastAsia="Times New Roman" w:hAnsi="Times New Roman" w:cs="Times New Roman"/>
+          <w:color w:val="474747"/>
+          <w:sz w:val="26"/>
+          <w:szCs w:val="26"/>
+          <w:lang w:val="en-US" w:eastAsia="en-IN"/>
+        </w:rPr>
+        <w:t>="no-referrer-when-downgrade"&gt;&lt;/iframe&gt;</w:t>
       </w:r>
     </w:p>
     <w:sectPr>
@@ -2459,7 +2480,7 @@
 </file>
 
 <file path=word/numbering.xml><?xml version="1.0" encoding="utf-8"?>
-<w:numbering xmlns:wpc="http://schemas.microsoft.com/office/word/2010/wordprocessingCanvas" xmlns:cx="http://schemas.microsoft.com/office/drawing/2014/chartex" xmlns:cx1="http://schemas.microsoft.com/office/drawing/2015/9/8/chartex" xmlns:mc="http://schemas.openxmlformats.org/markup-compatibility/2006" xmlns:o="urn:schemas-microsoft-com:office:office" xmlns:r="http://schemas.openxmlformats.org/officeDocument/2006/relationships" xmlns:m="http://schemas.openxmlformats.org/officeDocument/2006/math" xmlns:v="urn:schemas-microsoft-com:vml" xmlns:wp14="http://schemas.microsoft.com/office/word/2010/wordprocessingDrawing" xmlns:wp="http://schemas.openxmlformats.org/drawingml/2006/wordprocessingDrawing" xmlns:w10="urn:schemas-microsoft-com:office:word" xmlns:w="http://schemas.openxmlformats.org/wordprocessingml/2006/main" xmlns:w14="http://schemas.microsoft.com/office/word/2010/wordml" xmlns:w15="http://schemas.microsoft.com/office/word/2012/wordml" xmlns:w16se="http://schemas.microsoft.com/office/word/2015/wordml/symex" xmlns:wpg="http://schemas.microsoft.com/office/word/2010/wordprocessingGroup" xmlns:wpi="http://schemas.microsoft.com/office/word/2010/wordprocessingInk" xmlns:wne="http://schemas.microsoft.com/office/word/2006/wordml" xmlns:wps="http://schemas.microsoft.com/office/word/2010/wordprocessingShape" mc:Ignorable="w14 w15 w16se wp14">
+<w:numbering xmlns:wpc="http://schemas.microsoft.com/office/word/2010/wordprocessingCanvas" xmlns:mc="http://schemas.openxmlformats.org/markup-compatibility/2006" xmlns:o="urn:schemas-microsoft-com:office:office" xmlns:r="http://schemas.openxmlformats.org/officeDocument/2006/relationships" xmlns:m="http://schemas.openxmlformats.org/officeDocument/2006/math" xmlns:v="urn:schemas-microsoft-com:vml" xmlns:wp14="http://schemas.microsoft.com/office/word/2010/wordprocessingDrawing" xmlns:wp="http://schemas.openxmlformats.org/drawingml/2006/wordprocessingDrawing" xmlns:w10="urn:schemas-microsoft-com:office:word" xmlns:w="http://schemas.openxmlformats.org/wordprocessingml/2006/main" xmlns:w14="http://schemas.microsoft.com/office/word/2010/wordml" xmlns:w15="http://schemas.microsoft.com/office/word/2012/wordml" xmlns:wpg="http://schemas.microsoft.com/office/word/2010/wordprocessingGroup" xmlns:wpi="http://schemas.microsoft.com/office/word/2010/wordprocessingInk" xmlns:wne="http://schemas.microsoft.com/office/word/2006/wordml" xmlns:wps="http://schemas.microsoft.com/office/word/2010/wordprocessingShape" mc:Ignorable="w14 w15 wp14">
   <w:abstractNum w:abstractNumId="0" w15:restartNumberingAfterBreak="0">
     <w:nsid w:val="066203CC"/>
     <w:multiLevelType w:val="multilevel"/>
@@ -3072,7 +3093,7 @@
 </file>
 
 <file path=word/styles.xml><?xml version="1.0" encoding="utf-8"?>
-<w:styles xmlns:mc="http://schemas.openxmlformats.org/markup-compatibility/2006" xmlns:r="http://schemas.openxmlformats.org/officeDocument/2006/relationships" xmlns:w="http://schemas.openxmlformats.org/wordprocessingml/2006/main" xmlns:w14="http://schemas.microsoft.com/office/word/2010/wordml" xmlns:w15="http://schemas.microsoft.com/office/word/2012/wordml" xmlns:w16se="http://schemas.microsoft.com/office/word/2015/wordml/symex" mc:Ignorable="w14 w15 w16se">
+<w:styles xmlns:mc="http://schemas.openxmlformats.org/markup-compatibility/2006" xmlns:r="http://schemas.openxmlformats.org/officeDocument/2006/relationships" xmlns:w="http://schemas.openxmlformats.org/wordprocessingml/2006/main" xmlns:w14="http://schemas.microsoft.com/office/word/2010/wordml" xmlns:w15="http://schemas.microsoft.com/office/word/2012/wordml" mc:Ignorable="w14 w15">
   <w:docDefaults>
     <w:rPrDefault>
       <w:rPr>
@@ -3548,6 +3569,17 @@
       <w:contextualSpacing/>
     </w:pPr>
   </w:style>
+  <w:style w:type="character" w:styleId="Hyperlink">
+    <w:name w:val="Hyperlink"/>
+    <w:basedOn w:val="DefaultParagraphFont"/>
+    <w:uiPriority w:val="99"/>
+    <w:unhideWhenUsed/>
+    <w:rsid w:val="0071673E"/>
+    <w:rPr>
+      <w:color w:val="0563C1" w:themeColor="hyperlink"/>
+      <w:u w:val="single"/>
+    </w:rPr>
+  </w:style>
 </w:styles>
 </file>
 

</xml_diff>